<commit_message>
Fix the broken appendix reference in the paper's reproducibility section
The PR78 edit turned "\ref{tab:negative}" into a carriage return followed by
"ef{tab:negative}" in main_en.tex and main_ko.tex, so the docx showed
"Appendix Table ef{tab:negative}" (Korean: "부록 표 ef{...}"). Restore the
\ref and regenerate both docx files. Because of that stray CR, git also kept
the two .tex files with CRLF line endings; they are LF again, as before PR78.

Co-Authored-By: Claude Opus 5.5 <noreply@anthropic.com>
</commit_message>
<xml_diff>
--- a/reports/paper_draft_2026-10-23/InsPLAD_QA_paper_en.docx
+++ b/reports/paper_draft_2026-10-23/InsPLAD_QA_paper_en.docx
@@ -19278,7 +19278,13 @@
         <w:jc w:val="both"/>
       </w:pPr>
       <w:r>
-        <w:t xml:space="preserve">Code, prompts, frozen configurations, Colab notebooks, leaderboards and per-question answers for the main results are in the project repository, together with a summary of every follow-up run. Some dev follow-ups in Appendix Table ef{tab:negative} (the other LVLMs, anomaly detectors, cross-model re-check and part-evidence and alignment probes) ran from frozen source bundles; their code is archived rather than in the repository. Raw per-call logs (prompts, outputs, latencies) and all of this archived code are kept with SHA-256 hashes and available on request. Runs record the model ID, backend, benchmark commit, protocol and status; the later runs (agent, matched-call, MiniCPM re-run) also record the GPU. Notebooks verify the exact code revision before inference and resume from checkpoints saved every 20 calls.</w:t>
+        <w:t xml:space="preserve">Code, prompts, frozen configurations, Colab notebooks, leaderboards and per-question answers for the main results are in the project repository, together with a summary of every follow-up run. Some dev follow-ups in Appendix Table </w:t>
+      </w:r>
+      <w:r>
+        <w:t xml:space="preserve">10</w:t>
+      </w:r>
+      <w:r>
+        <w:t xml:space="preserve"> (the other LVLMs, anomaly detectors, cross-model re-check and part-evidence and alignment probes) ran from frozen source bundles; their code is archived rather than in the repository. Raw per-call logs (prompts, outputs, latencies) and all of this archived code are kept with SHA-256 hashes and available on request. Runs record the model ID, backend, benchmark commit, protocol and status; the later runs (agent, matched-call, MiniCPM re-run) also record the GPU. Notebooks verify the exact code revision before inference and resume from checkpoints saved every 20 calls.</w:t>
       </w:r>
     </w:p>
     <w:sectPr>

</xml_diff>

<commit_message>
Fix the broken appendix reference in the paper's reproducibility section (#79)
The PR78 edit turned "\ref{tab:negative}" into a carriage return followed by
"ef{tab:negative}" in main_en.tex and main_ko.tex, so the docx showed
"Appendix Table ef{tab:negative}" (Korean: "부록 표 ef{...}"). Restore the
\ref and regenerate both docx files. Because of that stray CR, git also kept
the two .tex files with CRLF line endings; they are LF again, as before PR78.

Co-authored-by: Claude Opus 5.5 <noreply@anthropic.com>
</commit_message>
<xml_diff>
--- a/reports/paper_draft_2026-10-23/InsPLAD_QA_paper_en.docx
+++ b/reports/paper_draft_2026-10-23/InsPLAD_QA_paper_en.docx
@@ -19278,7 +19278,13 @@
         <w:jc w:val="both"/>
       </w:pPr>
       <w:r>
-        <w:t xml:space="preserve">Code, prompts, frozen configurations, Colab notebooks, leaderboards and per-question answers for the main results are in the project repository, together with a summary of every follow-up run. Some dev follow-ups in Appendix Table ef{tab:negative} (the other LVLMs, anomaly detectors, cross-model re-check and part-evidence and alignment probes) ran from frozen source bundles; their code is archived rather than in the repository. Raw per-call logs (prompts, outputs, latencies) and all of this archived code are kept with SHA-256 hashes and available on request. Runs record the model ID, backend, benchmark commit, protocol and status; the later runs (agent, matched-call, MiniCPM re-run) also record the GPU. Notebooks verify the exact code revision before inference and resume from checkpoints saved every 20 calls.</w:t>
+        <w:t xml:space="preserve">Code, prompts, frozen configurations, Colab notebooks, leaderboards and per-question answers for the main results are in the project repository, together with a summary of every follow-up run. Some dev follow-ups in Appendix Table </w:t>
+      </w:r>
+      <w:r>
+        <w:t xml:space="preserve">10</w:t>
+      </w:r>
+      <w:r>
+        <w:t xml:space="preserve"> (the other LVLMs, anomaly detectors, cross-model re-check and part-evidence and alignment probes) ran from frozen source bundles; their code is archived rather than in the repository. Raw per-call logs (prompts, outputs, latencies) and all of this archived code are kept with SHA-256 hashes and available on request. Runs record the model ID, backend, benchmark commit, protocol and status; the later runs (agent, matched-call, MiniCPM re-run) also record the GPU. Notebooks verify the exact code revision before inference and resume from checkpoints saved every 20 calls.</w:t>
       </w:r>
     </w:p>
     <w:sectPr>

</xml_diff>

<commit_message>
Polish the paper prose and redesign the figures
- Shorten the abstract and remove staged contrasts and one-line closers
  in main_en.tex and main_ko.tex; split the long setup and reference
  paragraphs. Every number left out of the abstract stays in the body
  or tables.
- Rewrite make_figures.py with one style for all four figures: role
  colours, titled cards, Arial / Malgun Gothic. The pipeline figure now
  has two rows (gold set and baselines, dev set and agent), the QA
  examples are a 2x2 grid with correct/wrong cell colours, and the
  agent figure's control box no longer crosses the arrows.
- Regenerate the eight figure PNGs and both Word versions.

Co-Authored-By: Claude Opus 5.5 <noreply@anthropic.com>
</commit_message>
<xml_diff>
--- a/reports/paper_draft_2026-10-23/InsPLAD_QA_paper_en.docx
+++ b/reports/paper_draft_2026-10-23/InsPLAD_QA_paper_en.docx
@@ -80,7 +80,7 @@
         <w:jc w:val="both"/>
       </w:pPr>
       <w:r>
-        <w:t xml:space="preserve">Large vision-language models (LVLMs) are increasingly proposed as zero-shot inspectors, but power-line inspection has no benchmark that tests whether they detect a defect, name it, and stay consistent across these questions. We build </w:t>
+        <w:t xml:space="preserve">Large vision-language models (LVLMs) are increasingly proposed as zero-shot inspectors, yet no power-line inspection benchmark tests whether they detect a defect, name it, and answer consistently. We build </w:t>
       </w:r>
       <w:r>
         <w:rPr>
@@ -90,55 +90,25 @@
         <w:t xml:space="preserve">InsPLAD-QA</w:t>
       </w:r>
       <w:r>
-        <w:t xml:space="preserve">, an MMAD-style question-answering benchmark on the public InsPLAD UAV dataset. We align its anomaly-detection and fault-classification releases by exact image hashes and manually review a frozen gold set of 246 images and 534 questions. Under one prompt, output schema and evaluator, we compare four open LVLMs from different model lines and one API pipeline. All five are tested image-only; the four open models are also tested with a normal reference, a defect reference, both, and 20 vision-expert cues. A normal reference raises anomaly-detection F1 for every open model, although MiniCPM-V-4.5 gets there by flagging most normal images (balanced accuracy .656 </w:t>
+        <w:t xml:space="preserve">, an MMAD-style question-answering benchmark on the public InsPLAD UAV dataset. We align its two releases by exact image hashes and freeze a manually reviewed gold set of 246 images and 534 questions. Four open LVLMs and one API pipeline share one prompt, output schema and evaluator; the open models are also tested with a normal reference, a defect reference, both, and 20 vision-expert cues. A normal reference raises anomaly-detection F1 for every open model, although MiniCPM-V-4.5's balanced accuracy falls (.656 </w:t>
       </w:r>
       <w:r>
         <w:t xml:space="preserve">→</w:t>
       </w:r>
       <w:r>
-        <w:t xml:space="preserve"> .587). Expert cues mostly raise defect-type F1 but lower anomaly-detection F1, and no cue improves both for every model. We then evaluate a question-independent verification agent that was chosen on a disjoint development set and run once on gold. It raises defect-type macro-F1 from .522 to .640 (</w:t>
-      </w:r>
-      <w:r>
-        <w:t xml:space="preserve">+.118</w:t>
-      </w:r>
-      <w:r>
-        <w:t xml:space="preserve">, paired 95% CI </w:t>
+        <w:t xml:space="preserve"> .587) because it flags most normal images. Expert cues mostly raise defect-type F1 and lower anomaly-detection F1. A question-independent verification agent, chosen on a disjoint development set and run once on gold, raises defect-type macro-F1 from .522 to .640 (paired 95% CI of the gain </w:t>
       </w:r>
       <w:r>
         <w:t xml:space="preserve">[+.043,+.199]</w:t>
       </w:r>
       <w:r>
-        <w:t xml:space="preserve">) and region-presence balanced accuracy from .551 to .828 (</w:t>
-      </w:r>
-      <w:r>
-        <w:t xml:space="preserve">+.277</w:t>
-      </w:r>
-      <w:r>
-        <w:t xml:space="preserve">, </w:t>
-      </w:r>
-      <w:r>
-        <w:t xml:space="preserve">[+.222,+.328]</w:t>
-      </w:r>
-      <w:r>
-        <w:t xml:space="preserve">). Normal false alarms fall from 93/107 to 16/107. A control that re-asks with the same number of calls but without the agent's definitions and staging falls well short (</w:t>
-      </w:r>
-      <w:r>
-        <w:t xml:space="preserve">−.164</w:t>
-      </w:r>
-      <w:r>
-        <w:t xml:space="preserve"> Q2 macro-F1 and </w:t>
-      </w:r>
-      <w:r>
-        <w:t xml:space="preserve">−.203</w:t>
-      </w:r>
-      <w:r>
-        <w:t xml:space="preserve"> presence BAcc versus the agent, CIs exclude zero), so the gain is not explained by extra calls. The same agent, however, misses more defects (4/139 </w:t>
+        <w:t xml:space="preserve">) and region-presence balanced accuracy from .551 to .828, and cuts normal false alarms from 93/107 to 16/107. An equal-call re-ask without the agent's definitions and staging trails it by .164 macro-F1 and .203 presence BAcc (both CIs exclude zero), so extra calls do not explain the gain. The agent also misses more defects (4/139 </w:t>
       </w:r>
       <w:r>
         <w:t xml:space="preserve">→</w:t>
       </w:r>
       <w:r>
-        <w:t xml:space="preserve"> 27/139). For missing insulator caps it reports a defect region in only 9 of 27 images (direct question: 23) and names the defect in 5 of 27 (direct: 7); a revised variant names it in only 2. Follow-up attempts with higher resolution, other LVLMs, anomaly detectors and part-evidence tools did not reliably recover these defects. The LVLM did not report them even when shown a crop of the annotated location; only an asset-specific supervised classifier detected them. We release the benchmark, code and per-question model answers, and argue that inspection benchmarks must report false alarms and misses separately rather than a single accuracy. </w:t>
+        <w:t xml:space="preserve"> 27/139), mostly missing insulator caps: it reports a defect region on 9 of 27 (direct question: 23) and names the defect on 5 (direct: 7). Higher resolution, other LVLMs, anomaly detectors and part-evidence tools did not reliably recover these defects, and the LVLM missed them even on crops of the annotated location; only an asset-specific supervised classifier found them. We release the benchmark, code and per-question answers, and recommend that inspection benchmarks report false alarms and misses separately. </w:t>
       </w:r>
     </w:p>
     <w:p>
@@ -260,13 +230,13 @@
         <w:jc w:val="both"/>
       </w:pPr>
       <w:r>
-        <w:t xml:space="preserve">A question-independent verification agent evaluated once on gold after selection on a disjoint development set. Its gains in defect typing and region presence come with a measured increase in missed defects, which we report as a trade-off rather than a net improvement (Section </w:t>
+        <w:t xml:space="preserve">A question-independent verification agent, selected on a disjoint development set and evaluated once on gold. It improves defect typing and region presence and also misses more defects, and we report both (Section </w:t>
       </w:r>
       <w:r>
         <w:t xml:space="preserve">5</w:t>
       </w:r>
       <w:r>
-        <w:t xml:space="preserve">). A matched-call control shows that the gain is not explained by the extra calls. Re-asking with the same number of calls but without definitions or staging does not reproduce it, and re-asking alone shifts answers towards “normal”.</w:t>
+        <w:t xml:space="preserve">). A matched-call control, which re-asks with the same number of calls but without definitions or staging, does not reproduce the gain and shifts answers towards “normal”.</w:t>
       </w:r>
     </w:p>
     <w:p>
@@ -473,7 +443,7 @@
       <w:r>
         <w:drawing>
           <wp:inline distT="0" distB="0" distL="0" distR="0">
-            <wp:extent cx="5905500" cy="2276475"/>
+            <wp:extent cx="5905500" cy="2486025"/>
             <wp:effectExtent t="0" r="0" b="0" l="0"/>
             <wp:docPr id="1" name=""/>
             <wp:cNvGraphicFramePr>
@@ -498,7 +468,7 @@
                   <pic:spPr bwMode="auto">
                     <a:xfrm>
                       <a:off x="0" y="0"/>
-                      <a:ext cx="5905500" cy="2276475"/>
+                      <a:ext cx="5905500" cy="2486025"/>
                     </a:xfrm>
                     <a:prstGeom prst="rect">
                       <a:avLst/>
@@ -530,7 +500,7 @@
           <w:sz w:val="19"/>
           <w:szCs w:val="19"/>
         </w:rPr>
-        <w:t xml:space="preserve">Benchmark construction (top) and evaluation (bottom). The verification agent is designed on the dev set and run once on the frozen gold set.</w:t>
+        <w:t xml:space="preserve">How the benchmark is built and used. Top: the frozen gold set and the baseline comparison. Bottom: the dev set, on which the verification agent is designed before its single gold run.</w:t>
       </w:r>
     </w:p>
     <w:p>
@@ -737,7 +707,7 @@
       <w:r>
         <w:drawing>
           <wp:inline distT="0" distB="0" distL="0" distR="0">
-            <wp:extent cx="5905500" cy="2447925"/>
+            <wp:extent cx="5905500" cy="2886075"/>
             <wp:effectExtent t="0" r="0" b="0" l="0"/>
             <wp:docPr id="2" name=""/>
             <wp:cNvGraphicFramePr>
@@ -762,7 +732,7 @@
                   <pic:spPr bwMode="auto">
                     <a:xfrm>
                       <a:off x="0" y="0"/>
-                      <a:ext cx="5905500" cy="2447925"/>
+                      <a:ext cx="5905500" cy="2886075"/>
                     </a:xfrm>
                     <a:prstGeom prst="rect">
                       <a:avLst/>
@@ -2489,7 +2459,16 @@
         <w:t xml:space="preserve">[18]</w:t>
       </w:r>
       <w:r>
-        <w:t xml:space="preserve">. Three of the four use Qwen-series language backbones, so they are not fully independent. We also include a two-stage API pipeline (Luxia document vision followed by a 32B language model). All open models run unquantized with greedy decoding, using Transformers 5.14.0 as pinned in the Colab notebooks, on a GPU with at least 20 GB of memory. The notebooks allow an L4 or an A100; the agent, matched-call and MiniCPM re-runs record an NVIDIA L4 (22 GB). MiniCPM-V-4.5's chat interface samples by default (temperature 0.7), and we found this only after its first gold runs. We therefore re-ran its image-only and three reference conditions greedily with unchanged prompts, images and references (2,136 calls, 0 errors, 0 invalid outputs). Its rows in Tables </w:t>
+        <w:t xml:space="preserve">. Three of the four use Qwen-series language backbones, so they are not fully independent. We also include a two-stage API pipeline (Luxia document vision followed by a 32B language model). All open models run unquantized with greedy decoding, using Transformers 5.14.0 as pinned in the Colab notebooks, on a GPU with at least 20 GB of memory. The notebooks allow an L4 or an A100; the agent, matched-call and MiniCPM re-runs record an NVIDIA L4 (22 GB).</w:t>
+      </w:r>
+    </w:p>
+    <w:p>
+      <w:pPr>
+        <w:spacing w:after="120" w:line="276"/>
+        <w:jc w:val="both"/>
+      </w:pPr>
+      <w:r>
+        <w:t xml:space="preserve">MiniCPM-V-4.5's chat interface samples by default (temperature 0.7), which we noticed only after its first gold runs. We therefore re-ran its image-only and three reference conditions greedily with unchanged prompts, images and references (2,136 calls, 0 errors, 0 invalid outputs). Its rows in Tables </w:t>
       </w:r>
       <w:r>
         <w:t xml:space="preserve">2</w:t>
@@ -2513,7 +2492,16 @@
         <w:t xml:space="preserve">10</w:t>
       </w:r>
       <w:r>
-        <w:t xml:space="preserve">). All agent experiments are greedy. InternVL uses a fixed total budget of six visual tiles per sample, divided among the images (each multi-tile image also gets a thumbnail). Adding one reference halves the target's tiles, and adding two leaves it a third. We treat this as a fixed visual-token budget rather than a free resolution increase.</w:t>
+        <w:t xml:space="preserve">). All agent experiments are greedy.</w:t>
+      </w:r>
+    </w:p>
+    <w:p>
+      <w:pPr>
+        <w:spacing w:after="120" w:line="276"/>
+        <w:jc w:val="both"/>
+      </w:pPr>
+      <w:r>
+        <w:t xml:space="preserve">InternVL uses a fixed total budget of six visual tiles per sample, divided among the images (each multi-tile image also gets a thumbnail). Adding one reference halves the target's tiles, and adding two leaves it a third, so a reference adds context at the cost of target resolution.</w:t>
       </w:r>
     </w:p>
     <w:p>
@@ -4578,7 +4566,16 @@
         <w:t xml:space="preserve">[+.430,+.634]</w:t>
       </w:r>
       <w:r>
-        <w:t xml:space="preserve">). A higher Q1 score therefore does not imply better fault understanding. With a defect reference, three of the four models detect almost no defect (Q1 F1 </w:t>
+        <w:t xml:space="preserve">). A higher Q1 score therefore does not imply better fault understanding.</w:t>
+      </w:r>
+    </w:p>
+    <w:p>
+      <w:pPr>
+        <w:spacing w:after="120" w:line="276"/>
+        <w:jc w:val="both"/>
+      </w:pPr>
+      <w:r>
+        <w:t xml:space="preserve">With a defect reference, three of the four models detect almost no defect (Q1 F1 </w:t>
       </w:r>
       <w:r>
         <w:t xml:space="preserve">≤</w:t>
@@ -4590,13 +4587,22 @@
         <w:t xml:space="preserve">3</w:t>
       </w:r>
       <w:r>
-        <w:t xml:space="preserve">), and 14 references are even cropped from the same photograph as their target. The obvious explanation, that a model answers “normal” when the specific defect shown is absent from the target, therefore does not fit. MiniCPM-V-4.5's per-question answers show the opposite (Table </w:t>
+        <w:t xml:space="preserve">), and 14 references are even cropped from the same photograph as their target. The simple explanation, that a model answers “normal” because the defect shown is absent from the target, therefore does not fit. MiniCPM-V-4.5's per-question answers show the opposite (Table </w:t>
       </w:r>
       <w:r>
         <w:t xml:space="preserve">4</w:t>
       </w:r>
       <w:r>
-        <w:t xml:space="preserve">): it called 105 of the 106 targets whose reference shows their own defect type normal, including all 27 missing caps. Adding the normal reference restores detection (63 of 106). We read this as a role confusion: a single reference image is taken as the normal standard, as in the usual one-shot setting, so a target that resembles it is judged normal despite the prompt's label. Per-question answers for this condition are available only for MiniCPM-V-4.5, and we did not test the role hypothesis directly (for example by relabelling the same reference), so it remains a hypothesis. Vision-expert cues trade one question against the other. Averaged over the 20 configurations, they lower Q1 F1 for InternVL (.597</w:t>
+        <w:t xml:space="preserve">): it called 105 of the 106 targets whose reference shows their own defect type normal, including all 27 missing caps. Adding the normal reference restores detection (63 of 106). We read this as a role confusion: a single reference image is taken as the normal standard, as in the usual one-shot setting, so a target that resembles it is judged normal despite the prompt's label. Per-question answers for this condition are available only for MiniCPM-V-4.5, and we did not test the role hypothesis directly (for example by relabelling the same reference), so it remains a hypothesis.</w:t>
+      </w:r>
+    </w:p>
+    <w:p>
+      <w:pPr>
+        <w:spacing w:after="120" w:line="276"/>
+        <w:jc w:val="both"/>
+      </w:pPr>
+      <w:r>
+        <w:t xml:space="preserve">Vision-expert cues trade one question against the other. Averaged over the 20 configurations, they lower Q1 F1 for InternVL (.597</w:t>
       </w:r>
       <w:r>
         <w:t xml:space="preserve">→</w:t>
@@ -10266,7 +10272,7 @@
       <w:r>
         <w:drawing>
           <wp:inline distT="0" distB="0" distL="0" distR="0">
-            <wp:extent cx="5905500" cy="1895475"/>
+            <wp:extent cx="5905500" cy="2038350"/>
             <wp:effectExtent t="0" r="0" b="0" l="0"/>
             <wp:docPr id="3" name=""/>
             <wp:cNvGraphicFramePr>
@@ -10291,7 +10297,7 @@
                   <pic:spPr bwMode="auto">
                     <a:xfrm>
                       <a:off x="0" y="0"/>
-                      <a:ext cx="5905500" cy="1895475"/>
+                      <a:ext cx="5905500" cy="2038350"/>
                     </a:xfrm>
                     <a:prstGeom prst="rect">
                       <a:avLst/>
@@ -10467,7 +10473,7 @@
       <w:r>
         <w:drawing>
           <wp:inline distT="0" distB="0" distL="0" distR="0">
-            <wp:extent cx="5905500" cy="2533650"/>
+            <wp:extent cx="5905500" cy="2486025"/>
             <wp:effectExtent t="0" r="0" b="0" l="0"/>
             <wp:docPr id="4" name=""/>
             <wp:cNvGraphicFramePr>
@@ -10492,7 +10498,7 @@
                   <pic:spPr bwMode="auto">
                     <a:xfrm>
                       <a:off x="0" y="0"/>
-                      <a:ext cx="5905500" cy="2533650"/>
+                      <a:ext cx="5905500" cy="2486025"/>
                     </a:xfrm>
                     <a:prstGeom prst="rect">
                       <a:avLst/>
@@ -10643,7 +10649,7 @@
         <w:jc w:val="both"/>
       </w:pPr>
       <w:r>
-        <w:t xml:space="preserve">The gain is not free. Defective images judged defect-free rise from 4/139 to 27/139, and the CI of this false-none increase excludes zero (</w:t>
+        <w:t xml:space="preserve">The agent also misses more defects. Defective images judged defect-free rise from 4/139 to 27/139, and the CI of this false-none increase excludes zero (</w:t>
       </w:r>
       <w:r>
         <w:t xml:space="preserve">+.165</w:t>
@@ -16296,7 +16302,7 @@
         <w:t xml:space="preserve">8</w:t>
       </w:r>
       <w:r>
-        <w:t xml:space="preserve">). The gain is therefore not explained by additional calls; it needs what the agent adds, namely option definitions for Q2 and presence-then-position staging for Q3. Because the control removes both at once, it does not separate the information in the definitions from the effect of the staging.</w:t>
+        <w:t xml:space="preserve">). Additional calls therefore do not explain the gain; it depends on what the agent adds, namely option definitions for Q2 and presence-then-position staging for Q3. The control removes both at once, so it cannot separate the information in the definitions from the effect of the staging.</w:t>
       </w:r>
     </w:p>
     <w:p>
@@ -16377,7 +16383,7 @@
         <w:t xml:space="preserve">[+.079,+.201]</w:t>
       </w:r>
       <w:r>
-        <w:t xml:space="preserve">). Missing caps account for most of this gap: the re-ask still reports a region on 20 of 27 of them, the staged agent on 9. Asking again therefore already makes the model somewhat more conservative. The agent's additions turn that shift into a large net gain while also enlarging the miss rate.</w:t>
+        <w:t xml:space="preserve">). Missing caps account for most of this gap: the re-ask still reports a region on 20 of 27 of them, the staged agent on 9. Asking again already makes the model somewhat more conservative, and the agent's additions turn that shift into a large net gain while enlarging the miss rate.</w:t>
       </w:r>
     </w:p>
     <w:p>
@@ -16530,7 +16536,7 @@
         <w:jc w:val="both"/>
       </w:pPr>
       <w:r>
-        <w:t xml:space="preserve">In summary, training-free changes to input, wording, model or added tools did not make the 8B LVLM register missing caps, even with the region cropped for it. Explicit evidence from a supervised classifier did change its answers. We read this as a perception limit for this defect type. Prompts and routing still modulate it, however: on gold the agent's own definitions and staging lowered missing-cap answers. We therefore do not claim that they play no role.</w:t>
+        <w:t xml:space="preserve">In summary, training-free changes to input, wording, model or added tools did not make the 8B LVLM register missing caps, even with the region cropped for it. Explicit evidence from a supervised classifier did change its answers. We read this as a perception limit for this defect type, which prompts and routing still modulate: on gold, the agent's own definitions and staging lowered missing-cap answers.</w:t>
       </w:r>
     </w:p>
     <w:p>
@@ -16555,7 +16561,7 @@
           <w:b/>
           <w:bCs/>
         </w:rPr>
-        <w:t xml:space="preserve">A trade-off, not a free gain. </w:t>
+        <w:t xml:space="preserve">Fewer false alarms, more misses. </w:t>
       </w:r>
       <w:r>
         <w:t xml:space="preserve">The verification agent makes the model more conservative. The matched-call control shows that part of this conservatism comes simply from asking again </w:t>
@@ -16580,7 +16586,7 @@
         <w:t xml:space="preserve">What we propose. </w:t>
       </w:r>
       <w:r>
-        <w:t xml:space="preserve">The problem is not the false alarms the agent removes but the defects it hides. On gold the staged Q3 turned 24 defects that the direct question had flagged into “no region”, 15 of them missing caps, and a missing component can lead to a line failure while a false alarm costs a second look. We therefore do not recommend using the agent's “no defect” as a final decision. Our data suggest three directions.</w:t>
+        <w:t xml:space="preserve">The risk lies in the defects the agent hides. On gold the staged Q3 turned 24 defects that the direct question had flagged into “no region”, 15 of them missing caps, and a missing component can lead to a line failure while a false alarm costs a second look. We therefore do not recommend using the agent's “no defect” as a final decision. Our data suggest three directions.</w:t>
       </w:r>
     </w:p>
     <w:p>
@@ -16601,7 +16607,7 @@
         <w:t xml:space="preserve">Disagreement as a triage signal.</w:t>
       </w:r>
       <w:r>
-        <w:t xml:space="preserve"> The direct and staged Q3 disagree on 102 of the 246 images (41%). If a human reviews only these and is right, misses fall from 27 to 3 (all missing caps) and 16 false alarms remain. This is a post-hoc illustration on gold, not a tuned policy. Simply taking the union of the two answers is no alternative: it restores the direct question's 93 normal false alarms.</w:t>
+        <w:t xml:space="preserve"> The direct and staged Q3 disagree on 102 of the 246 images (41%). If a human reviews only these and is right, misses fall from 27 to 3 (all missing caps) and 16 false alarms remain. We computed this post hoc on gold to illustrate the idea and did not tune a review rule. Taking the union of the two answers does not help: it restores the direct question's 93 normal false alarms.</w:t>
       </w:r>
     </w:p>
     <w:p>
@@ -16628,7 +16634,7 @@
         <w:t xml:space="preserve">6</w:t>
       </w:r>
       <w:r>
-        <w:t xml:space="preserve">). A hybrid in which a small supervised detector can veto “normal” for high-risk classes gives up the training-free premise in exchange for safety.</w:t>
+        <w:t xml:space="preserve">). A hybrid in which a small supervised detector can veto “normal” for high-risk classes trades the training-free premise for safety.</w:t>
       </w:r>
     </w:p>
     <w:p>
@@ -16695,7 +16701,7 @@
         <w:jc w:val="both"/>
       </w:pPr>
       <w:r>
-        <w:t xml:space="preserve">InsPLAD-QA provides a hash-aligned, manually reviewed benchmark for LVLM power-line inspection with a shared prompt, schema and evaluator. Normal references raise anomaly-detection F1, though for MiniCPM-V-4.5 balanced accuracy falls, and their effect on coherence is mixed. Anomaly-detector cues trade anomaly detection for defect typing. A question-independent verification agent improves defect typing and region presence, while trading false alarms for misses. An equal-call re-ask does not reproduce this gain, so it comes from what the agent adds rather than from extra calls. Missing components were not reliably recovered by the training-free interventions we tried, even with crops of the annotated location.</w:t>
+        <w:t xml:space="preserve">InsPLAD-QA provides a hash-aligned, manually reviewed benchmark for LVLM power-line inspection with a shared prompt, schema and evaluator. Normal references raise anomaly-detection F1, though for MiniCPM-V-4.5 balanced accuracy falls, and their effect on coherence is mixed. Anomaly-detector cues trade anomaly detection for defect typing. A question-independent verification agent improves defect typing and region presence and trades false alarms for misses. An equal-call re-ask does not reproduce the gain, which therefore comes from the agent's definitions and staging. None of the training-free interventions we tried reliably recovered missing components, even with crops of the annotated location.</w:t>
       </w:r>
     </w:p>
     <w:p>

</xml_diff>

<commit_message>
Polish the paper prose and redesign the figures (#81)
- Shorten the abstract and remove staged contrasts and one-line closers
  in main_en.tex and main_ko.tex; split the long setup and reference
  paragraphs. Every number left out of the abstract stays in the body
  or tables.
- Rewrite make_figures.py with one style for all four figures: role
  colours, titled cards, Arial / Malgun Gothic. The pipeline figure now
  has two rows (gold set and baselines, dev set and agent), the QA
  examples are a 2x2 grid with correct/wrong cell colours, and the
  agent figure's control box no longer crosses the arrows.
- Regenerate the eight figure PNGs and both Word versions.

Co-authored-by: Claude Opus 5.5 <noreply@anthropic.com>
</commit_message>
<xml_diff>
--- a/reports/paper_draft_2026-10-23/InsPLAD_QA_paper_en.docx
+++ b/reports/paper_draft_2026-10-23/InsPLAD_QA_paper_en.docx
@@ -80,7 +80,7 @@
         <w:jc w:val="both"/>
       </w:pPr>
       <w:r>
-        <w:t xml:space="preserve">Large vision-language models (LVLMs) are increasingly proposed as zero-shot inspectors, but power-line inspection has no benchmark that tests whether they detect a defect, name it, and stay consistent across these questions. We build </w:t>
+        <w:t xml:space="preserve">Large vision-language models (LVLMs) are increasingly proposed as zero-shot inspectors, yet no power-line inspection benchmark tests whether they detect a defect, name it, and answer consistently. We build </w:t>
       </w:r>
       <w:r>
         <w:rPr>
@@ -90,55 +90,25 @@
         <w:t xml:space="preserve">InsPLAD-QA</w:t>
       </w:r>
       <w:r>
-        <w:t xml:space="preserve">, an MMAD-style question-answering benchmark on the public InsPLAD UAV dataset. We align its anomaly-detection and fault-classification releases by exact image hashes and manually review a frozen gold set of 246 images and 534 questions. Under one prompt, output schema and evaluator, we compare four open LVLMs from different model lines and one API pipeline. All five are tested image-only; the four open models are also tested with a normal reference, a defect reference, both, and 20 vision-expert cues. A normal reference raises anomaly-detection F1 for every open model, although MiniCPM-V-4.5 gets there by flagging most normal images (balanced accuracy .656 </w:t>
+        <w:t xml:space="preserve">, an MMAD-style question-answering benchmark on the public InsPLAD UAV dataset. We align its two releases by exact image hashes and freeze a manually reviewed gold set of 246 images and 534 questions. Four open LVLMs and one API pipeline share one prompt, output schema and evaluator; the open models are also tested with a normal reference, a defect reference, both, and 20 vision-expert cues. A normal reference raises anomaly-detection F1 for every open model, although MiniCPM-V-4.5's balanced accuracy falls (.656 </w:t>
       </w:r>
       <w:r>
         <w:t xml:space="preserve">→</w:t>
       </w:r>
       <w:r>
-        <w:t xml:space="preserve"> .587). Expert cues mostly raise defect-type F1 but lower anomaly-detection F1, and no cue improves both for every model. We then evaluate a question-independent verification agent that was chosen on a disjoint development set and run once on gold. It raises defect-type macro-F1 from .522 to .640 (</w:t>
-      </w:r>
-      <w:r>
-        <w:t xml:space="preserve">+.118</w:t>
-      </w:r>
-      <w:r>
-        <w:t xml:space="preserve">, paired 95% CI </w:t>
+        <w:t xml:space="preserve"> .587) because it flags most normal images. Expert cues mostly raise defect-type F1 and lower anomaly-detection F1. A question-independent verification agent, chosen on a disjoint development set and run once on gold, raises defect-type macro-F1 from .522 to .640 (paired 95% CI of the gain </w:t>
       </w:r>
       <w:r>
         <w:t xml:space="preserve">[+.043,+.199]</w:t>
       </w:r>
       <w:r>
-        <w:t xml:space="preserve">) and region-presence balanced accuracy from .551 to .828 (</w:t>
-      </w:r>
-      <w:r>
-        <w:t xml:space="preserve">+.277</w:t>
-      </w:r>
-      <w:r>
-        <w:t xml:space="preserve">, </w:t>
-      </w:r>
-      <w:r>
-        <w:t xml:space="preserve">[+.222,+.328]</w:t>
-      </w:r>
-      <w:r>
-        <w:t xml:space="preserve">). Normal false alarms fall from 93/107 to 16/107. A control that re-asks with the same number of calls but without the agent's definitions and staging falls well short (</w:t>
-      </w:r>
-      <w:r>
-        <w:t xml:space="preserve">−.164</w:t>
-      </w:r>
-      <w:r>
-        <w:t xml:space="preserve"> Q2 macro-F1 and </w:t>
-      </w:r>
-      <w:r>
-        <w:t xml:space="preserve">−.203</w:t>
-      </w:r>
-      <w:r>
-        <w:t xml:space="preserve"> presence BAcc versus the agent, CIs exclude zero), so the gain is not explained by extra calls. The same agent, however, misses more defects (4/139 </w:t>
+        <w:t xml:space="preserve">) and region-presence balanced accuracy from .551 to .828, and cuts normal false alarms from 93/107 to 16/107. An equal-call re-ask without the agent's definitions and staging trails it by .164 macro-F1 and .203 presence BAcc (both CIs exclude zero), so extra calls do not explain the gain. The agent also misses more defects (4/139 </w:t>
       </w:r>
       <w:r>
         <w:t xml:space="preserve">→</w:t>
       </w:r>
       <w:r>
-        <w:t xml:space="preserve"> 27/139). For missing insulator caps it reports a defect region in only 9 of 27 images (direct question: 23) and names the defect in 5 of 27 (direct: 7); a revised variant names it in only 2. Follow-up attempts with higher resolution, other LVLMs, anomaly detectors and part-evidence tools did not reliably recover these defects. The LVLM did not report them even when shown a crop of the annotated location; only an asset-specific supervised classifier detected them. We release the benchmark, code and per-question model answers, and argue that inspection benchmarks must report false alarms and misses separately rather than a single accuracy. </w:t>
+        <w:t xml:space="preserve"> 27/139), mostly missing insulator caps: it reports a defect region on 9 of 27 (direct question: 23) and names the defect on 5 (direct: 7). Higher resolution, other LVLMs, anomaly detectors and part-evidence tools did not reliably recover these defects, and the LVLM missed them even on crops of the annotated location; only an asset-specific supervised classifier found them. We release the benchmark, code and per-question answers, and recommend that inspection benchmarks report false alarms and misses separately. </w:t>
       </w:r>
     </w:p>
     <w:p>
@@ -260,13 +230,13 @@
         <w:jc w:val="both"/>
       </w:pPr>
       <w:r>
-        <w:t xml:space="preserve">A question-independent verification agent evaluated once on gold after selection on a disjoint development set. Its gains in defect typing and region presence come with a measured increase in missed defects, which we report as a trade-off rather than a net improvement (Section </w:t>
+        <w:t xml:space="preserve">A question-independent verification agent, selected on a disjoint development set and evaluated once on gold. It improves defect typing and region presence and also misses more defects, and we report both (Section </w:t>
       </w:r>
       <w:r>
         <w:t xml:space="preserve">5</w:t>
       </w:r>
       <w:r>
-        <w:t xml:space="preserve">). A matched-call control shows that the gain is not explained by the extra calls. Re-asking with the same number of calls but without definitions or staging does not reproduce it, and re-asking alone shifts answers towards “normal”.</w:t>
+        <w:t xml:space="preserve">). A matched-call control, which re-asks with the same number of calls but without definitions or staging, does not reproduce the gain and shifts answers towards “normal”.</w:t>
       </w:r>
     </w:p>
     <w:p>
@@ -473,7 +443,7 @@
       <w:r>
         <w:drawing>
           <wp:inline distT="0" distB="0" distL="0" distR="0">
-            <wp:extent cx="5905500" cy="2276475"/>
+            <wp:extent cx="5905500" cy="2486025"/>
             <wp:effectExtent t="0" r="0" b="0" l="0"/>
             <wp:docPr id="1" name=""/>
             <wp:cNvGraphicFramePr>
@@ -498,7 +468,7 @@
                   <pic:spPr bwMode="auto">
                     <a:xfrm>
                       <a:off x="0" y="0"/>
-                      <a:ext cx="5905500" cy="2276475"/>
+                      <a:ext cx="5905500" cy="2486025"/>
                     </a:xfrm>
                     <a:prstGeom prst="rect">
                       <a:avLst/>
@@ -530,7 +500,7 @@
           <w:sz w:val="19"/>
           <w:szCs w:val="19"/>
         </w:rPr>
-        <w:t xml:space="preserve">Benchmark construction (top) and evaluation (bottom). The verification agent is designed on the dev set and run once on the frozen gold set.</w:t>
+        <w:t xml:space="preserve">How the benchmark is built and used. Top: the frozen gold set and the baseline comparison. Bottom: the dev set, on which the verification agent is designed before its single gold run.</w:t>
       </w:r>
     </w:p>
     <w:p>
@@ -737,7 +707,7 @@
       <w:r>
         <w:drawing>
           <wp:inline distT="0" distB="0" distL="0" distR="0">
-            <wp:extent cx="5905500" cy="2447925"/>
+            <wp:extent cx="5905500" cy="2886075"/>
             <wp:effectExtent t="0" r="0" b="0" l="0"/>
             <wp:docPr id="2" name=""/>
             <wp:cNvGraphicFramePr>
@@ -762,7 +732,7 @@
                   <pic:spPr bwMode="auto">
                     <a:xfrm>
                       <a:off x="0" y="0"/>
-                      <a:ext cx="5905500" cy="2447925"/>
+                      <a:ext cx="5905500" cy="2886075"/>
                     </a:xfrm>
                     <a:prstGeom prst="rect">
                       <a:avLst/>
@@ -2489,7 +2459,16 @@
         <w:t xml:space="preserve">[18]</w:t>
       </w:r>
       <w:r>
-        <w:t xml:space="preserve">. Three of the four use Qwen-series language backbones, so they are not fully independent. We also include a two-stage API pipeline (Luxia document vision followed by a 32B language model). All open models run unquantized with greedy decoding, using Transformers 5.14.0 as pinned in the Colab notebooks, on a GPU with at least 20 GB of memory. The notebooks allow an L4 or an A100; the agent, matched-call and MiniCPM re-runs record an NVIDIA L4 (22 GB). MiniCPM-V-4.5's chat interface samples by default (temperature 0.7), and we found this only after its first gold runs. We therefore re-ran its image-only and three reference conditions greedily with unchanged prompts, images and references (2,136 calls, 0 errors, 0 invalid outputs). Its rows in Tables </w:t>
+        <w:t xml:space="preserve">. Three of the four use Qwen-series language backbones, so they are not fully independent. We also include a two-stage API pipeline (Luxia document vision followed by a 32B language model). All open models run unquantized with greedy decoding, using Transformers 5.14.0 as pinned in the Colab notebooks, on a GPU with at least 20 GB of memory. The notebooks allow an L4 or an A100; the agent, matched-call and MiniCPM re-runs record an NVIDIA L4 (22 GB).</w:t>
+      </w:r>
+    </w:p>
+    <w:p>
+      <w:pPr>
+        <w:spacing w:after="120" w:line="276"/>
+        <w:jc w:val="both"/>
+      </w:pPr>
+      <w:r>
+        <w:t xml:space="preserve">MiniCPM-V-4.5's chat interface samples by default (temperature 0.7), which we noticed only after its first gold runs. We therefore re-ran its image-only and three reference conditions greedily with unchanged prompts, images and references (2,136 calls, 0 errors, 0 invalid outputs). Its rows in Tables </w:t>
       </w:r>
       <w:r>
         <w:t xml:space="preserve">2</w:t>
@@ -2513,7 +2492,16 @@
         <w:t xml:space="preserve">10</w:t>
       </w:r>
       <w:r>
-        <w:t xml:space="preserve">). All agent experiments are greedy. InternVL uses a fixed total budget of six visual tiles per sample, divided among the images (each multi-tile image also gets a thumbnail). Adding one reference halves the target's tiles, and adding two leaves it a third. We treat this as a fixed visual-token budget rather than a free resolution increase.</w:t>
+        <w:t xml:space="preserve">). All agent experiments are greedy.</w:t>
+      </w:r>
+    </w:p>
+    <w:p>
+      <w:pPr>
+        <w:spacing w:after="120" w:line="276"/>
+        <w:jc w:val="both"/>
+      </w:pPr>
+      <w:r>
+        <w:t xml:space="preserve">InternVL uses a fixed total budget of six visual tiles per sample, divided among the images (each multi-tile image also gets a thumbnail). Adding one reference halves the target's tiles, and adding two leaves it a third, so a reference adds context at the cost of target resolution.</w:t>
       </w:r>
     </w:p>
     <w:p>
@@ -4578,7 +4566,16 @@
         <w:t xml:space="preserve">[+.430,+.634]</w:t>
       </w:r>
       <w:r>
-        <w:t xml:space="preserve">). A higher Q1 score therefore does not imply better fault understanding. With a defect reference, three of the four models detect almost no defect (Q1 F1 </w:t>
+        <w:t xml:space="preserve">). A higher Q1 score therefore does not imply better fault understanding.</w:t>
+      </w:r>
+    </w:p>
+    <w:p>
+      <w:pPr>
+        <w:spacing w:after="120" w:line="276"/>
+        <w:jc w:val="both"/>
+      </w:pPr>
+      <w:r>
+        <w:t xml:space="preserve">With a defect reference, three of the four models detect almost no defect (Q1 F1 </w:t>
       </w:r>
       <w:r>
         <w:t xml:space="preserve">≤</w:t>
@@ -4590,13 +4587,22 @@
         <w:t xml:space="preserve">3</w:t>
       </w:r>
       <w:r>
-        <w:t xml:space="preserve">), and 14 references are even cropped from the same photograph as their target. The obvious explanation, that a model answers “normal” when the specific defect shown is absent from the target, therefore does not fit. MiniCPM-V-4.5's per-question answers show the opposite (Table </w:t>
+        <w:t xml:space="preserve">), and 14 references are even cropped from the same photograph as their target. The simple explanation, that a model answers “normal” because the defect shown is absent from the target, therefore does not fit. MiniCPM-V-4.5's per-question answers show the opposite (Table </w:t>
       </w:r>
       <w:r>
         <w:t xml:space="preserve">4</w:t>
       </w:r>
       <w:r>
-        <w:t xml:space="preserve">): it called 105 of the 106 targets whose reference shows their own defect type normal, including all 27 missing caps. Adding the normal reference restores detection (63 of 106). We read this as a role confusion: a single reference image is taken as the normal standard, as in the usual one-shot setting, so a target that resembles it is judged normal despite the prompt's label. Per-question answers for this condition are available only for MiniCPM-V-4.5, and we did not test the role hypothesis directly (for example by relabelling the same reference), so it remains a hypothesis. Vision-expert cues trade one question against the other. Averaged over the 20 configurations, they lower Q1 F1 for InternVL (.597</w:t>
+        <w:t xml:space="preserve">): it called 105 of the 106 targets whose reference shows their own defect type normal, including all 27 missing caps. Adding the normal reference restores detection (63 of 106). We read this as a role confusion: a single reference image is taken as the normal standard, as in the usual one-shot setting, so a target that resembles it is judged normal despite the prompt's label. Per-question answers for this condition are available only for MiniCPM-V-4.5, and we did not test the role hypothesis directly (for example by relabelling the same reference), so it remains a hypothesis.</w:t>
+      </w:r>
+    </w:p>
+    <w:p>
+      <w:pPr>
+        <w:spacing w:after="120" w:line="276"/>
+        <w:jc w:val="both"/>
+      </w:pPr>
+      <w:r>
+        <w:t xml:space="preserve">Vision-expert cues trade one question against the other. Averaged over the 20 configurations, they lower Q1 F1 for InternVL (.597</w:t>
       </w:r>
       <w:r>
         <w:t xml:space="preserve">→</w:t>
@@ -10266,7 +10272,7 @@
       <w:r>
         <w:drawing>
           <wp:inline distT="0" distB="0" distL="0" distR="0">
-            <wp:extent cx="5905500" cy="1895475"/>
+            <wp:extent cx="5905500" cy="2038350"/>
             <wp:effectExtent t="0" r="0" b="0" l="0"/>
             <wp:docPr id="3" name=""/>
             <wp:cNvGraphicFramePr>
@@ -10291,7 +10297,7 @@
                   <pic:spPr bwMode="auto">
                     <a:xfrm>
                       <a:off x="0" y="0"/>
-                      <a:ext cx="5905500" cy="1895475"/>
+                      <a:ext cx="5905500" cy="2038350"/>
                     </a:xfrm>
                     <a:prstGeom prst="rect">
                       <a:avLst/>
@@ -10467,7 +10473,7 @@
       <w:r>
         <w:drawing>
           <wp:inline distT="0" distB="0" distL="0" distR="0">
-            <wp:extent cx="5905500" cy="2533650"/>
+            <wp:extent cx="5905500" cy="2486025"/>
             <wp:effectExtent t="0" r="0" b="0" l="0"/>
             <wp:docPr id="4" name=""/>
             <wp:cNvGraphicFramePr>
@@ -10492,7 +10498,7 @@
                   <pic:spPr bwMode="auto">
                     <a:xfrm>
                       <a:off x="0" y="0"/>
-                      <a:ext cx="5905500" cy="2533650"/>
+                      <a:ext cx="5905500" cy="2486025"/>
                     </a:xfrm>
                     <a:prstGeom prst="rect">
                       <a:avLst/>
@@ -10643,7 +10649,7 @@
         <w:jc w:val="both"/>
       </w:pPr>
       <w:r>
-        <w:t xml:space="preserve">The gain is not free. Defective images judged defect-free rise from 4/139 to 27/139, and the CI of this false-none increase excludes zero (</w:t>
+        <w:t xml:space="preserve">The agent also misses more defects. Defective images judged defect-free rise from 4/139 to 27/139, and the CI of this false-none increase excludes zero (</w:t>
       </w:r>
       <w:r>
         <w:t xml:space="preserve">+.165</w:t>
@@ -16296,7 +16302,7 @@
         <w:t xml:space="preserve">8</w:t>
       </w:r>
       <w:r>
-        <w:t xml:space="preserve">). The gain is therefore not explained by additional calls; it needs what the agent adds, namely option definitions for Q2 and presence-then-position staging for Q3. Because the control removes both at once, it does not separate the information in the definitions from the effect of the staging.</w:t>
+        <w:t xml:space="preserve">). Additional calls therefore do not explain the gain; it depends on what the agent adds, namely option definitions for Q2 and presence-then-position staging for Q3. The control removes both at once, so it cannot separate the information in the definitions from the effect of the staging.</w:t>
       </w:r>
     </w:p>
     <w:p>
@@ -16377,7 +16383,7 @@
         <w:t xml:space="preserve">[+.079,+.201]</w:t>
       </w:r>
       <w:r>
-        <w:t xml:space="preserve">). Missing caps account for most of this gap: the re-ask still reports a region on 20 of 27 of them, the staged agent on 9. Asking again therefore already makes the model somewhat more conservative. The agent's additions turn that shift into a large net gain while also enlarging the miss rate.</w:t>
+        <w:t xml:space="preserve">). Missing caps account for most of this gap: the re-ask still reports a region on 20 of 27 of them, the staged agent on 9. Asking again already makes the model somewhat more conservative, and the agent's additions turn that shift into a large net gain while enlarging the miss rate.</w:t>
       </w:r>
     </w:p>
     <w:p>
@@ -16530,7 +16536,7 @@
         <w:jc w:val="both"/>
       </w:pPr>
       <w:r>
-        <w:t xml:space="preserve">In summary, training-free changes to input, wording, model or added tools did not make the 8B LVLM register missing caps, even with the region cropped for it. Explicit evidence from a supervised classifier did change its answers. We read this as a perception limit for this defect type. Prompts and routing still modulate it, however: on gold the agent's own definitions and staging lowered missing-cap answers. We therefore do not claim that they play no role.</w:t>
+        <w:t xml:space="preserve">In summary, training-free changes to input, wording, model or added tools did not make the 8B LVLM register missing caps, even with the region cropped for it. Explicit evidence from a supervised classifier did change its answers. We read this as a perception limit for this defect type, which prompts and routing still modulate: on gold, the agent's own definitions and staging lowered missing-cap answers.</w:t>
       </w:r>
     </w:p>
     <w:p>
@@ -16555,7 +16561,7 @@
           <w:b/>
           <w:bCs/>
         </w:rPr>
-        <w:t xml:space="preserve">A trade-off, not a free gain. </w:t>
+        <w:t xml:space="preserve">Fewer false alarms, more misses. </w:t>
       </w:r>
       <w:r>
         <w:t xml:space="preserve">The verification agent makes the model more conservative. The matched-call control shows that part of this conservatism comes simply from asking again </w:t>
@@ -16580,7 +16586,7 @@
         <w:t xml:space="preserve">What we propose. </w:t>
       </w:r>
       <w:r>
-        <w:t xml:space="preserve">The problem is not the false alarms the agent removes but the defects it hides. On gold the staged Q3 turned 24 defects that the direct question had flagged into “no region”, 15 of them missing caps, and a missing component can lead to a line failure while a false alarm costs a second look. We therefore do not recommend using the agent's “no defect” as a final decision. Our data suggest three directions.</w:t>
+        <w:t xml:space="preserve">The risk lies in the defects the agent hides. On gold the staged Q3 turned 24 defects that the direct question had flagged into “no region”, 15 of them missing caps, and a missing component can lead to a line failure while a false alarm costs a second look. We therefore do not recommend using the agent's “no defect” as a final decision. Our data suggest three directions.</w:t>
       </w:r>
     </w:p>
     <w:p>
@@ -16601,7 +16607,7 @@
         <w:t xml:space="preserve">Disagreement as a triage signal.</w:t>
       </w:r>
       <w:r>
-        <w:t xml:space="preserve"> The direct and staged Q3 disagree on 102 of the 246 images (41%). If a human reviews only these and is right, misses fall from 27 to 3 (all missing caps) and 16 false alarms remain. This is a post-hoc illustration on gold, not a tuned policy. Simply taking the union of the two answers is no alternative: it restores the direct question's 93 normal false alarms.</w:t>
+        <w:t xml:space="preserve"> The direct and staged Q3 disagree on 102 of the 246 images (41%). If a human reviews only these and is right, misses fall from 27 to 3 (all missing caps) and 16 false alarms remain. We computed this post hoc on gold to illustrate the idea and did not tune a review rule. Taking the union of the two answers does not help: it restores the direct question's 93 normal false alarms.</w:t>
       </w:r>
     </w:p>
     <w:p>
@@ -16628,7 +16634,7 @@
         <w:t xml:space="preserve">6</w:t>
       </w:r>
       <w:r>
-        <w:t xml:space="preserve">). A hybrid in which a small supervised detector can veto “normal” for high-risk classes gives up the training-free premise in exchange for safety.</w:t>
+        <w:t xml:space="preserve">). A hybrid in which a small supervised detector can veto “normal” for high-risk classes trades the training-free premise for safety.</w:t>
       </w:r>
     </w:p>
     <w:p>
@@ -16695,7 +16701,7 @@
         <w:jc w:val="both"/>
       </w:pPr>
       <w:r>
-        <w:t xml:space="preserve">InsPLAD-QA provides a hash-aligned, manually reviewed benchmark for LVLM power-line inspection with a shared prompt, schema and evaluator. Normal references raise anomaly-detection F1, though for MiniCPM-V-4.5 balanced accuracy falls, and their effect on coherence is mixed. Anomaly-detector cues trade anomaly detection for defect typing. A question-independent verification agent improves defect typing and region presence, while trading false alarms for misses. An equal-call re-ask does not reproduce this gain, so it comes from what the agent adds rather than from extra calls. Missing components were not reliably recovered by the training-free interventions we tried, even with crops of the annotated location.</w:t>
+        <w:t xml:space="preserve">InsPLAD-QA provides a hash-aligned, manually reviewed benchmark for LVLM power-line inspection with a shared prompt, schema and evaluator. Normal references raise anomaly-detection F1, though for MiniCPM-V-4.5 balanced accuracy falls, and their effect on coherence is mixed. Anomaly-detector cues trade anomaly detection for defect typing. A question-independent verification agent improves defect typing and region presence and trades false alarms for misses. An equal-call re-ask does not reproduce the gain, which therefore comes from the agent's definitions and staging. None of the training-free interventions we tried reliably recovered missing components, even with crops of the annotated location.</w:t>
       </w:r>
     </w:p>
     <w:p>

</xml_diff>